<commit_message>
update bai tap fix 20260410
</commit_message>
<xml_diff>
--- a/Hung/20260410/Bai tap viet Judge.docx
+++ b/Hung/20260410/Bai tap viet Judge.docx
@@ -1,6 +1,6 @@
 
 <file path=word/document.xml><?xml version="1.0" encoding="utf-8"?>
-<w:document xmlns:wpc="http://schemas.microsoft.com/office/word/2010/wordprocessingCanvas" xmlns:cx="http://schemas.microsoft.com/office/drawing/2014/chartex" xmlns:cx1="http://schemas.microsoft.com/office/drawing/2015/9/8/chartex" xmlns:cx2="http://schemas.microsoft.com/office/drawing/2015/10/21/chartex" xmlns:cx3="http://schemas.microsoft.com/office/drawing/2016/5/9/chartex" xmlns:cx4="http://schemas.microsoft.com/office/drawing/2016/5/10/chartex" xmlns:cx5="http://schemas.microsoft.com/office/drawing/2016/5/11/chartex" xmlns:cx6="http://schemas.microsoft.com/office/drawing/2016/5/12/chartex" xmlns:cx7="http://schemas.microsoft.com/office/drawing/2016/5/13/chartex" xmlns:cx8="http://schemas.microsoft.com/office/drawing/2016/5/14/chartex" xmlns:mc="http://schemas.openxmlformats.org/markup-compatibility/2006" xmlns:aink="http://schemas.microsoft.com/office/drawing/2016/ink" xmlns:am3d="http://schemas.microsoft.com/office/drawing/2017/model3d" xmlns:o="urn:schemas-microsoft-com:office:office" xmlns:r="http://schemas.openxmlformats.org/officeDocument/2006/relationships" xmlns:m="http://schemas.openxmlformats.org/officeDocument/2006/math" xmlns:v="urn:schemas-microsoft-com:vml" xmlns:wp14="http://schemas.microsoft.com/office/word/2010/wordprocessingDrawing" xmlns:wp="http://schemas.openxmlformats.org/drawingml/2006/wordprocessingDrawing" xmlns:w10="urn:schemas-microsoft-com:office:word" xmlns:w="http://schemas.openxmlformats.org/wordprocessingml/2006/main" xmlns:w14="http://schemas.microsoft.com/office/word/2010/wordml" xmlns:w15="http://schemas.microsoft.com/office/word/2012/wordml" xmlns:w16cex="http://schemas.microsoft.com/office/word/2018/wordml/cex" xmlns:w16cid="http://schemas.microsoft.com/office/word/2016/wordml/cid" xmlns:w16="http://schemas.microsoft.com/office/word/2018/wordml" xmlns:w16sdtdh="http://schemas.microsoft.com/office/word/2020/wordml/sdtdatahash" xmlns:w16se="http://schemas.microsoft.com/office/word/2015/wordml/symex" xmlns:wpg="http://schemas.microsoft.com/office/word/2010/wordprocessingGroup" xmlns:wpi="http://schemas.microsoft.com/office/word/2010/wordprocessingInk" xmlns:wne="http://schemas.microsoft.com/office/word/2006/wordml" xmlns:wps="http://schemas.microsoft.com/office/word/2010/wordprocessingShape" mc:Ignorable="w14 w15 w16se w16cid w16 w16cex w16sdtdh wp14">
+<w:document xmlns:wpc="http://schemas.microsoft.com/office/word/2010/wordprocessingCanvas" xmlns:cx="http://schemas.microsoft.com/office/drawing/2014/chartex" xmlns:cx1="http://schemas.microsoft.com/office/drawing/2015/9/8/chartex" xmlns:cx2="http://schemas.microsoft.com/office/drawing/2015/10/21/chartex" xmlns:cx3="http://schemas.microsoft.com/office/drawing/2016/5/9/chartex" xmlns:cx4="http://schemas.microsoft.com/office/drawing/2016/5/10/chartex" xmlns:cx5="http://schemas.microsoft.com/office/drawing/2016/5/11/chartex" xmlns:cx6="http://schemas.microsoft.com/office/drawing/2016/5/12/chartex" xmlns:cx7="http://schemas.microsoft.com/office/drawing/2016/5/13/chartex" xmlns:cx8="http://schemas.microsoft.com/office/drawing/2016/5/14/chartex" xmlns:mc="http://schemas.openxmlformats.org/markup-compatibility/2006" xmlns:aink="http://schemas.microsoft.com/office/drawing/2016/ink" xmlns:am3d="http://schemas.microsoft.com/office/drawing/2017/model3d" xmlns:o="urn:schemas-microsoft-com:office:office" xmlns:oel="http://schemas.microsoft.com/office/2019/extlst" xmlns:r="http://schemas.openxmlformats.org/officeDocument/2006/relationships" xmlns:m="http://schemas.openxmlformats.org/officeDocument/2006/math" xmlns:v="urn:schemas-microsoft-com:vml" xmlns:wp14="http://schemas.microsoft.com/office/word/2010/wordprocessingDrawing" xmlns:wp="http://schemas.openxmlformats.org/drawingml/2006/wordprocessingDrawing" xmlns:w10="urn:schemas-microsoft-com:office:word" xmlns:w="http://schemas.openxmlformats.org/wordprocessingml/2006/main" xmlns:w14="http://schemas.microsoft.com/office/word/2010/wordml" xmlns:w15="http://schemas.microsoft.com/office/word/2012/wordml" xmlns:w16cex="http://schemas.microsoft.com/office/word/2018/wordml/cex" xmlns:w16cid="http://schemas.microsoft.com/office/word/2016/wordml/cid" xmlns:w16="http://schemas.microsoft.com/office/word/2018/wordml" xmlns:w16du="http://schemas.microsoft.com/office/word/2023/wordml/word16du" xmlns:w16sdtdh="http://schemas.microsoft.com/office/word/2020/wordml/sdtdatahash" xmlns:w16sdtfl="http://schemas.microsoft.com/office/word/2024/wordml/sdtformatlock" xmlns:w16se="http://schemas.microsoft.com/office/word/2015/wordml/symex" xmlns:wpg="http://schemas.microsoft.com/office/word/2010/wordprocessingGroup" xmlns:wpi="http://schemas.microsoft.com/office/word/2010/wordprocessingInk" xmlns:wne="http://schemas.microsoft.com/office/word/2006/wordml" xmlns:wps="http://schemas.microsoft.com/office/word/2010/wordprocessingShape" mc:Ignorable="w14 w15 w16se w16cid w16 w16cex w16sdtdh w16sdtfl w16du wp14">
   <w:body>
     <w:p>
       <w:pPr>
@@ -1680,7 +1680,17 @@
           <w:sz w:val="21"/>
           <w:szCs w:val="21"/>
         </w:rPr>
-        <w:t>"Invalid input!</w:t>
+        <w:t xml:space="preserve">"Invalid </w:t>
+      </w:r>
+      <w:proofErr w:type="gramStart"/>
+      <w:r>
+        <w:rPr>
+          <w:rFonts w:ascii="Consolas" w:eastAsia="Times New Roman" w:hAnsi="Consolas" w:cs="Times New Roman"/>
+          <w:color w:val="A5D6FF"/>
+          <w:sz w:val="21"/>
+          <w:szCs w:val="21"/>
+        </w:rPr>
+        <w:t>input!</w:t>
       </w:r>
       <w:r>
         <w:rPr>
@@ -1689,7 +1699,17 @@
           <w:sz w:val="21"/>
           <w:szCs w:val="21"/>
         </w:rPr>
-        <w:t>\n</w:t>
+        <w:t>\</w:t>
+      </w:r>
+      <w:proofErr w:type="gramEnd"/>
+      <w:r>
+        <w:rPr>
+          <w:rFonts w:ascii="Consolas" w:eastAsia="Times New Roman" w:hAnsi="Consolas" w:cs="Times New Roman"/>
+          <w:color w:val="D7BA7D"/>
+          <w:sz w:val="21"/>
+          <w:szCs w:val="21"/>
+        </w:rPr>
+        <w:t>n</w:t>
       </w:r>
       <w:r>
         <w:rPr>
@@ -3122,23 +3142,13 @@
           <w:szCs w:val="24"/>
         </w:rPr>
       </w:pPr>
-      <w:proofErr w:type="spellStart"/>
-      <w:r>
-        <w:rPr>
-          <w:rFonts w:ascii="Times New Roman" w:eastAsia="Times New Roman" w:hAnsi="Times New Roman" w:cs="Times New Roman"/>
-          <w:sz w:val="24"/>
-          <w:szCs w:val="24"/>
-        </w:rPr>
-        <w:t>Xem</w:t>
-      </w:r>
-      <w:proofErr w:type="spellEnd"/>
-      <w:r>
-        <w:rPr>
-          <w:rFonts w:ascii="Times New Roman" w:eastAsia="Times New Roman" w:hAnsi="Times New Roman" w:cs="Times New Roman"/>
-          <w:sz w:val="24"/>
-          <w:szCs w:val="24"/>
-        </w:rPr>
-        <w:t xml:space="preserve"> </w:t>
+      <w:r>
+        <w:rPr>
+          <w:rFonts w:ascii="Times New Roman" w:eastAsia="Times New Roman" w:hAnsi="Times New Roman" w:cs="Times New Roman"/>
+          <w:sz w:val="24"/>
+          <w:szCs w:val="24"/>
+        </w:rPr>
+        <w:t xml:space="preserve">Xem </w:t>
       </w:r>
       <w:proofErr w:type="spellStart"/>
       <w:r>
@@ -3175,6 +3185,35 @@
           <w:szCs w:val="24"/>
         </w:rPr>
         <w:t xml:space="preserve"> </w:t>
+      </w:r>
+      <w:r>
+        <w:rPr>
+          <w:rFonts w:ascii="Times New Roman" w:eastAsia="Times New Roman" w:hAnsi="Times New Roman" w:cs="Times New Roman"/>
+          <w:sz w:val="24"/>
+          <w:szCs w:val="24"/>
+          <w:lang w:val="vi-VN"/>
+        </w:rPr>
+        <w:t xml:space="preserve">số </w:t>
+      </w:r>
+      <w:proofErr w:type="gramStart"/>
+      <w:r>
+        <w:rPr>
+          <w:rFonts w:ascii="Times New Roman" w:eastAsia="Times New Roman" w:hAnsi="Times New Roman" w:cs="Times New Roman"/>
+          <w:sz w:val="24"/>
+          <w:szCs w:val="24"/>
+          <w:lang w:val="vi-VN"/>
+        </w:rPr>
+        <w:t>nào ?</w:t>
+      </w:r>
+      <w:proofErr w:type="gramEnd"/>
+      <w:r>
+        <w:rPr>
+          <w:rFonts w:ascii="Times New Roman" w:eastAsia="Times New Roman" w:hAnsi="Times New Roman" w:cs="Times New Roman"/>
+          <w:sz w:val="24"/>
+          <w:szCs w:val="24"/>
+          <w:lang w:val="vi-VN"/>
+        </w:rPr>
+        <w:t xml:space="preserve"> -&gt; NG</w:t>
       </w:r>
     </w:p>
     <w:p>
@@ -3248,7 +3287,34 @@
           <w:sz w:val="24"/>
           <w:szCs w:val="24"/>
         </w:rPr>
-        <w:t xml:space="preserve"> = 1</w:t>
+        <w:t xml:space="preserve"> </w:t>
+      </w:r>
+      <w:proofErr w:type="spellStart"/>
+      <w:r>
+        <w:rPr>
+          <w:rFonts w:ascii="Times New Roman" w:eastAsia="Times New Roman" w:hAnsi="Times New Roman" w:cs="Times New Roman"/>
+          <w:sz w:val="24"/>
+          <w:szCs w:val="24"/>
+        </w:rPr>
+        <w:t>thực</w:t>
+      </w:r>
+      <w:proofErr w:type="spellEnd"/>
+      <w:r>
+        <w:rPr>
+          <w:rFonts w:ascii="Times New Roman" w:eastAsia="Times New Roman" w:hAnsi="Times New Roman" w:cs="Times New Roman"/>
+          <w:sz w:val="24"/>
+          <w:szCs w:val="24"/>
+          <w:lang w:val="vi-VN"/>
+        </w:rPr>
+        <w:t xml:space="preserve"> tế </w:t>
+      </w:r>
+      <w:r>
+        <w:rPr>
+          <w:rFonts w:ascii="Times New Roman" w:eastAsia="Times New Roman" w:hAnsi="Times New Roman" w:cs="Times New Roman"/>
+          <w:sz w:val="24"/>
+          <w:szCs w:val="24"/>
+        </w:rPr>
+        <w:t>= 1</w:t>
       </w:r>
     </w:p>
     <w:p>
@@ -3360,6 +3426,7 @@
           <w:rFonts w:ascii="Times New Roman" w:eastAsia="Times New Roman" w:hAnsi="Times New Roman" w:cs="Times New Roman"/>
           <w:sz w:val="24"/>
           <w:szCs w:val="24"/>
+          <w:lang w:val="vi-VN"/>
         </w:rPr>
       </w:pPr>
       <w:r>
@@ -3414,7 +3481,26 @@
           <w:sz w:val="24"/>
           <w:szCs w:val="24"/>
         </w:rPr>
-        <w:t xml:space="preserve"> ra</w:t>
+        <w:t xml:space="preserve"> </w:t>
+      </w:r>
+      <w:proofErr w:type="spellStart"/>
+      <w:r>
+        <w:rPr>
+          <w:rFonts w:ascii="Times New Roman" w:eastAsia="Times New Roman" w:hAnsi="Times New Roman" w:cs="Times New Roman"/>
+          <w:sz w:val="24"/>
+          <w:szCs w:val="24"/>
+        </w:rPr>
+        <w:t>ra</w:t>
+      </w:r>
+      <w:proofErr w:type="spellEnd"/>
+      <w:r>
+        <w:rPr>
+          <w:rFonts w:ascii="Times New Roman" w:eastAsia="Times New Roman" w:hAnsi="Times New Roman" w:cs="Times New Roman"/>
+          <w:sz w:val="24"/>
+          <w:szCs w:val="24"/>
+          <w:lang w:val="vi-VN"/>
+        </w:rPr>
+        <w:t xml:space="preserve"> hoặc cho số lần ví dụ 10/10</w:t>
       </w:r>
     </w:p>
     <w:p>
@@ -3695,6 +3781,7 @@
           <w:rFonts w:ascii="Times New Roman" w:eastAsia="Times New Roman" w:hAnsi="Times New Roman" w:cs="Times New Roman"/>
           <w:sz w:val="24"/>
           <w:szCs w:val="24"/>
+          <w:lang w:val="vi-VN"/>
         </w:rPr>
       </w:pPr>
     </w:p>
@@ -3705,6 +3792,7 @@
           <w:rFonts w:ascii="Times New Roman" w:eastAsia="Times New Roman" w:hAnsi="Times New Roman" w:cs="Times New Roman"/>
           <w:sz w:val="24"/>
           <w:szCs w:val="24"/>
+          <w:lang w:val="vi-VN"/>
         </w:rPr>
       </w:pPr>
       <w:r>
@@ -3714,179 +3802,26 @@
           <w:bCs/>
           <w:sz w:val="24"/>
           <w:szCs w:val="24"/>
-        </w:rPr>
-        <w:t>影響範囲</w:t>
-      </w:r>
-      <w:r>
-        <w:rPr>
-          <w:rFonts w:ascii="Times New Roman" w:eastAsia="Times New Roman" w:hAnsi="Times New Roman" w:cs="Times New Roman"/>
-          <w:sz w:val="24"/>
-          <w:szCs w:val="24"/>
+          <w:lang w:val="vi-VN"/>
+        </w:rPr>
+        <w:t>対応方法</w:t>
+      </w:r>
+      <w:r>
+        <w:rPr>
+          <w:rFonts w:ascii="Times New Roman" w:eastAsia="Times New Roman" w:hAnsi="Times New Roman" w:cs="Times New Roman"/>
+          <w:sz w:val="24"/>
+          <w:szCs w:val="24"/>
+          <w:lang w:val="vi-VN"/>
         </w:rPr>
         <w:br/>
-        <w:t xml:space="preserve">Sai </w:t>
-      </w:r>
-      <w:proofErr w:type="spellStart"/>
-      <w:r>
-        <w:rPr>
-          <w:rFonts w:ascii="Times New Roman" w:eastAsia="Times New Roman" w:hAnsi="Times New Roman" w:cs="Times New Roman"/>
-          <w:sz w:val="24"/>
-          <w:szCs w:val="24"/>
-        </w:rPr>
-        <w:t>chức</w:t>
-      </w:r>
-      <w:proofErr w:type="spellEnd"/>
-      <w:r>
-        <w:rPr>
-          <w:rFonts w:ascii="Times New Roman" w:eastAsia="Times New Roman" w:hAnsi="Times New Roman" w:cs="Times New Roman"/>
-          <w:sz w:val="24"/>
-          <w:szCs w:val="24"/>
-        </w:rPr>
-        <w:t xml:space="preserve"> </w:t>
-      </w:r>
-      <w:proofErr w:type="spellStart"/>
-      <w:r>
-        <w:rPr>
-          <w:rFonts w:ascii="Times New Roman" w:eastAsia="Times New Roman" w:hAnsi="Times New Roman" w:cs="Times New Roman"/>
-          <w:sz w:val="24"/>
-          <w:szCs w:val="24"/>
-        </w:rPr>
-        <w:t>năng</w:t>
-      </w:r>
-      <w:proofErr w:type="spellEnd"/>
-      <w:r>
-        <w:rPr>
-          <w:rFonts w:ascii="Times New Roman" w:eastAsia="Times New Roman" w:hAnsi="Times New Roman" w:cs="Times New Roman"/>
-          <w:sz w:val="24"/>
-          <w:szCs w:val="24"/>
-        </w:rPr>
-        <w:t xml:space="preserve"> </w:t>
-      </w:r>
-      <w:proofErr w:type="spellStart"/>
-      <w:r>
-        <w:rPr>
-          <w:rFonts w:ascii="Times New Roman" w:eastAsia="Times New Roman" w:hAnsi="Times New Roman" w:cs="Times New Roman"/>
-          <w:sz w:val="24"/>
-          <w:szCs w:val="24"/>
-        </w:rPr>
-        <w:t>tính</w:t>
-      </w:r>
-      <w:proofErr w:type="spellEnd"/>
-      <w:r>
-        <w:rPr>
-          <w:rFonts w:ascii="Times New Roman" w:eastAsia="Times New Roman" w:hAnsi="Times New Roman" w:cs="Times New Roman"/>
-          <w:sz w:val="24"/>
-          <w:szCs w:val="24"/>
-        </w:rPr>
-        <w:t xml:space="preserve"> </w:t>
-      </w:r>
-      <w:proofErr w:type="spellStart"/>
-      <w:r>
-        <w:rPr>
-          <w:rFonts w:ascii="Times New Roman" w:eastAsia="Times New Roman" w:hAnsi="Times New Roman" w:cs="Times New Roman"/>
-          <w:sz w:val="24"/>
-          <w:szCs w:val="24"/>
-        </w:rPr>
-        <w:t>tổng</w:t>
-      </w:r>
-      <w:proofErr w:type="spellEnd"/>
-      <w:r>
-        <w:rPr>
-          <w:rFonts w:ascii="Times New Roman" w:eastAsia="Times New Roman" w:hAnsi="Times New Roman" w:cs="Times New Roman"/>
-          <w:sz w:val="24"/>
-          <w:szCs w:val="24"/>
-        </w:rPr>
-        <w:t xml:space="preserve"> </w:t>
-      </w:r>
-      <w:proofErr w:type="spellStart"/>
-      <w:r>
-        <w:rPr>
-          <w:rFonts w:ascii="Times New Roman" w:eastAsia="Times New Roman" w:hAnsi="Times New Roman" w:cs="Times New Roman"/>
-          <w:sz w:val="24"/>
-          <w:szCs w:val="24"/>
-        </w:rPr>
-        <w:t>số</w:t>
-      </w:r>
-      <w:proofErr w:type="spellEnd"/>
-      <w:r>
-        <w:rPr>
-          <w:rFonts w:ascii="Times New Roman" w:eastAsia="Times New Roman" w:hAnsi="Times New Roman" w:cs="Times New Roman"/>
-          <w:sz w:val="24"/>
-          <w:szCs w:val="24"/>
-        </w:rPr>
-        <w:t xml:space="preserve"> </w:t>
-      </w:r>
-      <w:proofErr w:type="spellStart"/>
-      <w:r>
-        <w:rPr>
-          <w:rFonts w:ascii="Times New Roman" w:eastAsia="Times New Roman" w:hAnsi="Times New Roman" w:cs="Times New Roman"/>
-          <w:sz w:val="24"/>
-          <w:szCs w:val="24"/>
-        </w:rPr>
-        <w:t>chẵn</w:t>
-      </w:r>
-      <w:proofErr w:type="spellEnd"/>
-    </w:p>
-    <w:p>
-      <w:pPr>
-        <w:spacing w:after="0" w:line="240" w:lineRule="auto"/>
-        <w:rPr>
-          <w:rFonts w:ascii="Times New Roman" w:eastAsia="Times New Roman" w:hAnsi="Times New Roman" w:cs="Times New Roman"/>
-          <w:sz w:val="24"/>
-          <w:szCs w:val="24"/>
-        </w:rPr>
-      </w:pPr>
-    </w:p>
-    <w:p>
-      <w:pPr>
-        <w:spacing w:before="100" w:beforeAutospacing="1" w:after="100" w:afterAutospacing="1" w:line="240" w:lineRule="auto"/>
-        <w:rPr>
-          <w:rFonts w:ascii="Times New Roman" w:eastAsia="Times New Roman" w:hAnsi="Times New Roman" w:cs="Times New Roman"/>
-          <w:sz w:val="24"/>
-          <w:szCs w:val="24"/>
-        </w:rPr>
-      </w:pPr>
-      <w:r>
-        <w:rPr>
-          <w:rFonts w:ascii="MS Mincho" w:eastAsia="MS Mincho" w:hAnsi="MS Mincho" w:cs="MS Mincho" w:hint="eastAsia"/>
-          <w:b/>
-          <w:bCs/>
-          <w:sz w:val="24"/>
-          <w:szCs w:val="24"/>
-        </w:rPr>
-        <w:t>対応方法</w:t>
-      </w:r>
-      <w:r>
-        <w:rPr>
-          <w:rFonts w:ascii="Times New Roman" w:eastAsia="Times New Roman" w:hAnsi="Times New Roman" w:cs="Times New Roman"/>
-          <w:sz w:val="24"/>
-          <w:szCs w:val="24"/>
-        </w:rPr>
-        <w:br/>
-      </w:r>
-      <w:proofErr w:type="spellStart"/>
-      <w:r>
-        <w:rPr>
-          <w:rFonts w:ascii="Times New Roman" w:eastAsia="Times New Roman" w:hAnsi="Times New Roman" w:cs="Times New Roman"/>
-          <w:sz w:val="24"/>
-          <w:szCs w:val="24"/>
-        </w:rPr>
-        <w:t>Thay</w:t>
-      </w:r>
-      <w:proofErr w:type="spellEnd"/>
-      <w:r>
-        <w:rPr>
-          <w:rFonts w:ascii="Times New Roman" w:eastAsia="Times New Roman" w:hAnsi="Times New Roman" w:cs="Times New Roman"/>
-          <w:sz w:val="24"/>
-          <w:szCs w:val="24"/>
-        </w:rPr>
-        <w:t xml:space="preserve"> </w:t>
+        <w:t xml:space="preserve">Thay </w:t>
       </w:r>
       <w:r>
         <w:rPr>
           <w:rFonts w:ascii="Courier New" w:eastAsia="Times New Roman" w:hAnsi="Courier New" w:cs="Courier New"/>
           <w:sz w:val="20"/>
           <w:szCs w:val="20"/>
+          <w:lang w:val="vi-VN"/>
         </w:rPr>
         <w:t>break</w:t>
       </w:r>
@@ -3895,32 +3830,16 @@
           <w:rFonts w:ascii="Times New Roman" w:eastAsia="Times New Roman" w:hAnsi="Times New Roman" w:cs="Times New Roman"/>
           <w:sz w:val="24"/>
           <w:szCs w:val="24"/>
-        </w:rPr>
-        <w:t xml:space="preserve"> </w:t>
-      </w:r>
-      <w:proofErr w:type="spellStart"/>
-      <w:r>
-        <w:rPr>
-          <w:rFonts w:ascii="Times New Roman" w:eastAsia="Times New Roman" w:hAnsi="Times New Roman" w:cs="Times New Roman"/>
-          <w:sz w:val="24"/>
-          <w:szCs w:val="24"/>
-        </w:rPr>
-        <w:t>bằng</w:t>
-      </w:r>
-      <w:proofErr w:type="spellEnd"/>
-      <w:r>
-        <w:rPr>
-          <w:rFonts w:ascii="Times New Roman" w:eastAsia="Times New Roman" w:hAnsi="Times New Roman" w:cs="Times New Roman"/>
-          <w:sz w:val="24"/>
-          <w:szCs w:val="24"/>
-        </w:rPr>
-        <w:t xml:space="preserve"> </w:t>
+          <w:lang w:val="vi-VN"/>
+        </w:rPr>
+        <w:t xml:space="preserve"> bằng </w:t>
       </w:r>
       <w:r>
         <w:rPr>
           <w:rFonts w:ascii="Courier New" w:eastAsia="Times New Roman" w:hAnsi="Courier New" w:cs="Courier New"/>
           <w:sz w:val="20"/>
           <w:szCs w:val="20"/>
+          <w:lang w:val="vi-VN"/>
         </w:rPr>
         <w:t>continue</w:t>
       </w:r>
@@ -3929,145 +3848,10 @@
           <w:rFonts w:ascii="Times New Roman" w:eastAsia="Times New Roman" w:hAnsi="Times New Roman" w:cs="Times New Roman"/>
           <w:sz w:val="24"/>
           <w:szCs w:val="24"/>
-        </w:rPr>
-        <w:t xml:space="preserve"> </w:t>
-      </w:r>
-      <w:proofErr w:type="spellStart"/>
-      <w:r>
-        <w:rPr>
-          <w:rFonts w:ascii="Times New Roman" w:eastAsia="Times New Roman" w:hAnsi="Times New Roman" w:cs="Times New Roman"/>
-          <w:sz w:val="24"/>
-          <w:szCs w:val="24"/>
-        </w:rPr>
-        <w:t>để</w:t>
-      </w:r>
-      <w:proofErr w:type="spellEnd"/>
-      <w:r>
-        <w:rPr>
-          <w:rFonts w:ascii="Times New Roman" w:eastAsia="Times New Roman" w:hAnsi="Times New Roman" w:cs="Times New Roman"/>
-          <w:sz w:val="24"/>
-          <w:szCs w:val="24"/>
-        </w:rPr>
-        <w:t xml:space="preserve"> </w:t>
-      </w:r>
-      <w:proofErr w:type="spellStart"/>
-      <w:r>
-        <w:rPr>
-          <w:rFonts w:ascii="Times New Roman" w:eastAsia="Times New Roman" w:hAnsi="Times New Roman" w:cs="Times New Roman"/>
-          <w:sz w:val="24"/>
-          <w:szCs w:val="24"/>
-        </w:rPr>
-        <w:t>bỏ</w:t>
-      </w:r>
-      <w:proofErr w:type="spellEnd"/>
-      <w:r>
-        <w:rPr>
-          <w:rFonts w:ascii="Times New Roman" w:eastAsia="Times New Roman" w:hAnsi="Times New Roman" w:cs="Times New Roman"/>
-          <w:sz w:val="24"/>
-          <w:szCs w:val="24"/>
-        </w:rPr>
-        <w:t xml:space="preserve"> qua </w:t>
-      </w:r>
-      <w:proofErr w:type="spellStart"/>
-      <w:r>
-        <w:rPr>
-          <w:rFonts w:ascii="Times New Roman" w:eastAsia="Times New Roman" w:hAnsi="Times New Roman" w:cs="Times New Roman"/>
-          <w:sz w:val="24"/>
-          <w:szCs w:val="24"/>
-        </w:rPr>
-        <w:t>số</w:t>
-      </w:r>
-      <w:proofErr w:type="spellEnd"/>
-      <w:r>
-        <w:rPr>
-          <w:rFonts w:ascii="Times New Roman" w:eastAsia="Times New Roman" w:hAnsi="Times New Roman" w:cs="Times New Roman"/>
-          <w:sz w:val="24"/>
-          <w:szCs w:val="24"/>
-        </w:rPr>
-        <w:t xml:space="preserve"> </w:t>
-      </w:r>
-      <w:proofErr w:type="spellStart"/>
-      <w:r>
-        <w:rPr>
-          <w:rFonts w:ascii="Times New Roman" w:eastAsia="Times New Roman" w:hAnsi="Times New Roman" w:cs="Times New Roman"/>
-          <w:sz w:val="24"/>
-          <w:szCs w:val="24"/>
-        </w:rPr>
-        <w:t>lẻ</w:t>
-      </w:r>
-      <w:proofErr w:type="spellEnd"/>
-      <w:r>
-        <w:rPr>
-          <w:rFonts w:ascii="Times New Roman" w:eastAsia="Times New Roman" w:hAnsi="Times New Roman" w:cs="Times New Roman"/>
-          <w:sz w:val="24"/>
-          <w:szCs w:val="24"/>
-        </w:rPr>
-        <w:t xml:space="preserve"> </w:t>
-      </w:r>
-      <w:proofErr w:type="spellStart"/>
-      <w:r>
-        <w:rPr>
-          <w:rFonts w:ascii="Times New Roman" w:eastAsia="Times New Roman" w:hAnsi="Times New Roman" w:cs="Times New Roman"/>
-          <w:sz w:val="24"/>
-          <w:szCs w:val="24"/>
-        </w:rPr>
-        <w:t>và</w:t>
-      </w:r>
-      <w:proofErr w:type="spellEnd"/>
-      <w:r>
-        <w:rPr>
-          <w:rFonts w:ascii="Times New Roman" w:eastAsia="Times New Roman" w:hAnsi="Times New Roman" w:cs="Times New Roman"/>
-          <w:sz w:val="24"/>
-          <w:szCs w:val="24"/>
-        </w:rPr>
-        <w:t xml:space="preserve"> </w:t>
-      </w:r>
-      <w:proofErr w:type="spellStart"/>
-      <w:r>
-        <w:rPr>
-          <w:rFonts w:ascii="Times New Roman" w:eastAsia="Times New Roman" w:hAnsi="Times New Roman" w:cs="Times New Roman"/>
-          <w:sz w:val="24"/>
-          <w:szCs w:val="24"/>
-        </w:rPr>
-        <w:t>tiếp</w:t>
-      </w:r>
-      <w:proofErr w:type="spellEnd"/>
-      <w:r>
-        <w:rPr>
-          <w:rFonts w:ascii="Times New Roman" w:eastAsia="Times New Roman" w:hAnsi="Times New Roman" w:cs="Times New Roman"/>
-          <w:sz w:val="24"/>
-          <w:szCs w:val="24"/>
-        </w:rPr>
-        <w:t xml:space="preserve"> </w:t>
-      </w:r>
-      <w:proofErr w:type="spellStart"/>
-      <w:r>
-        <w:rPr>
-          <w:rFonts w:ascii="Times New Roman" w:eastAsia="Times New Roman" w:hAnsi="Times New Roman" w:cs="Times New Roman"/>
-          <w:sz w:val="24"/>
-          <w:szCs w:val="24"/>
-        </w:rPr>
-        <w:t>tục</w:t>
-      </w:r>
-      <w:proofErr w:type="spellEnd"/>
-      <w:r>
-        <w:rPr>
-          <w:rFonts w:ascii="Times New Roman" w:eastAsia="Times New Roman" w:hAnsi="Times New Roman" w:cs="Times New Roman"/>
-          <w:sz w:val="24"/>
-          <w:szCs w:val="24"/>
-        </w:rPr>
-        <w:t xml:space="preserve"> </w:t>
-      </w:r>
-      <w:proofErr w:type="spellStart"/>
-      <w:r>
-        <w:rPr>
-          <w:rFonts w:ascii="Times New Roman" w:eastAsia="Times New Roman" w:hAnsi="Times New Roman" w:cs="Times New Roman"/>
-          <w:sz w:val="24"/>
-          <w:szCs w:val="24"/>
-        </w:rPr>
-        <w:t>lặp</w:t>
-      </w:r>
-      <w:proofErr w:type="spellEnd"/>
+          <w:lang w:val="vi-VN"/>
+        </w:rPr>
+        <w:t xml:space="preserve"> để bỏ qua số lẻ và tiếp tục lặp</w:t>
+      </w:r>
     </w:p>
     <w:p>
       <w:pPr>
@@ -4076,6 +3860,7 @@
           <w:rFonts w:ascii="Times New Roman" w:eastAsia="Times New Roman" w:hAnsi="Times New Roman" w:cs="Times New Roman"/>
           <w:sz w:val="24"/>
           <w:szCs w:val="24"/>
+          <w:lang w:val="vi-VN"/>
         </w:rPr>
       </w:pPr>
     </w:p>
@@ -5247,7 +5032,7 @@
 </file>
 
 <file path=word/numbering.xml><?xml version="1.0" encoding="utf-8"?>
-<w:numbering xmlns:wpc="http://schemas.microsoft.com/office/word/2010/wordprocessingCanvas" xmlns:cx="http://schemas.microsoft.com/office/drawing/2014/chartex" xmlns:cx1="http://schemas.microsoft.com/office/drawing/2015/9/8/chartex" xmlns:cx2="http://schemas.microsoft.com/office/drawing/2015/10/21/chartex" xmlns:cx3="http://schemas.microsoft.com/office/drawing/2016/5/9/chartex" xmlns:cx4="http://schemas.microsoft.com/office/drawing/2016/5/10/chartex" xmlns:cx5="http://schemas.microsoft.com/office/drawing/2016/5/11/chartex" xmlns:cx6="http://schemas.microsoft.com/office/drawing/2016/5/12/chartex" xmlns:cx7="http://schemas.microsoft.com/office/drawing/2016/5/13/chartex" xmlns:cx8="http://schemas.microsoft.com/office/drawing/2016/5/14/chartex" xmlns:mc="http://schemas.openxmlformats.org/markup-compatibility/2006" xmlns:aink="http://schemas.microsoft.com/office/drawing/2016/ink" xmlns:am3d="http://schemas.microsoft.com/office/drawing/2017/model3d" xmlns:o="urn:schemas-microsoft-com:office:office" xmlns:r="http://schemas.openxmlformats.org/officeDocument/2006/relationships" xmlns:m="http://schemas.openxmlformats.org/officeDocument/2006/math" xmlns:v="urn:schemas-microsoft-com:vml" xmlns:wp14="http://schemas.microsoft.com/office/word/2010/wordprocessingDrawing" xmlns:wp="http://schemas.openxmlformats.org/drawingml/2006/wordprocessingDrawing" xmlns:w10="urn:schemas-microsoft-com:office:word" xmlns:w="http://schemas.openxmlformats.org/wordprocessingml/2006/main" xmlns:w14="http://schemas.microsoft.com/office/word/2010/wordml" xmlns:w15="http://schemas.microsoft.com/office/word/2012/wordml" xmlns:w16cex="http://schemas.microsoft.com/office/word/2018/wordml/cex" xmlns:w16cid="http://schemas.microsoft.com/office/word/2016/wordml/cid" xmlns:w16="http://schemas.microsoft.com/office/word/2018/wordml" xmlns:w16sdtdh="http://schemas.microsoft.com/office/word/2020/wordml/sdtdatahash" xmlns:w16se="http://schemas.microsoft.com/office/word/2015/wordml/symex" xmlns:wpg="http://schemas.microsoft.com/office/word/2010/wordprocessingGroup" xmlns:wpi="http://schemas.microsoft.com/office/word/2010/wordprocessingInk" xmlns:wne="http://schemas.microsoft.com/office/word/2006/wordml" xmlns:wps="http://schemas.microsoft.com/office/word/2010/wordprocessingShape" mc:Ignorable="w14 w15 w16se w16cid w16 w16cex w16sdtdh wp14">
+<w:numbering xmlns:wpc="http://schemas.microsoft.com/office/word/2010/wordprocessingCanvas" xmlns:cx="http://schemas.microsoft.com/office/drawing/2014/chartex" xmlns:cx1="http://schemas.microsoft.com/office/drawing/2015/9/8/chartex" xmlns:cx2="http://schemas.microsoft.com/office/drawing/2015/10/21/chartex" xmlns:cx3="http://schemas.microsoft.com/office/drawing/2016/5/9/chartex" xmlns:cx4="http://schemas.microsoft.com/office/drawing/2016/5/10/chartex" xmlns:cx5="http://schemas.microsoft.com/office/drawing/2016/5/11/chartex" xmlns:cx6="http://schemas.microsoft.com/office/drawing/2016/5/12/chartex" xmlns:cx7="http://schemas.microsoft.com/office/drawing/2016/5/13/chartex" xmlns:cx8="http://schemas.microsoft.com/office/drawing/2016/5/14/chartex" xmlns:mc="http://schemas.openxmlformats.org/markup-compatibility/2006" xmlns:aink="http://schemas.microsoft.com/office/drawing/2016/ink" xmlns:am3d="http://schemas.microsoft.com/office/drawing/2017/model3d" xmlns:o="urn:schemas-microsoft-com:office:office" xmlns:oel="http://schemas.microsoft.com/office/2019/extlst" xmlns:r="http://schemas.openxmlformats.org/officeDocument/2006/relationships" xmlns:m="http://schemas.openxmlformats.org/officeDocument/2006/math" xmlns:v="urn:schemas-microsoft-com:vml" xmlns:wp14="http://schemas.microsoft.com/office/word/2010/wordprocessingDrawing" xmlns:wp="http://schemas.openxmlformats.org/drawingml/2006/wordprocessingDrawing" xmlns:w10="urn:schemas-microsoft-com:office:word" xmlns:w="http://schemas.openxmlformats.org/wordprocessingml/2006/main" xmlns:w14="http://schemas.microsoft.com/office/word/2010/wordml" xmlns:w15="http://schemas.microsoft.com/office/word/2012/wordml" xmlns:w16cex="http://schemas.microsoft.com/office/word/2018/wordml/cex" xmlns:w16cid="http://schemas.microsoft.com/office/word/2016/wordml/cid" xmlns:w16="http://schemas.microsoft.com/office/word/2018/wordml" xmlns:w16du="http://schemas.microsoft.com/office/word/2023/wordml/word16du" xmlns:w16sdtdh="http://schemas.microsoft.com/office/word/2020/wordml/sdtdatahash" xmlns:w16sdtfl="http://schemas.microsoft.com/office/word/2024/wordml/sdtformatlock" xmlns:w16se="http://schemas.microsoft.com/office/word/2015/wordml/symex" xmlns:wpg="http://schemas.microsoft.com/office/word/2010/wordprocessingGroup" xmlns:wpi="http://schemas.microsoft.com/office/word/2010/wordprocessingInk" xmlns:wne="http://schemas.microsoft.com/office/word/2006/wordml" xmlns:wps="http://schemas.microsoft.com/office/word/2010/wordprocessingShape" mc:Ignorable="w14 w15 w16se w16cid w16 w16cex w16sdtdh w16sdtfl w16du wp14">
   <w:abstractNum w:abstractNumId="0" w15:restartNumberingAfterBreak="0">
     <w:nsid w:val="07D65164"/>
     <w:multiLevelType w:val="multilevel"/>
@@ -6517,38 +6302,38 @@
       </w:rPr>
     </w:lvl>
   </w:abstractNum>
-  <w:num w:numId="1">
+  <w:num w:numId="1" w16cid:durableId="332804889">
     <w:abstractNumId w:val="0"/>
   </w:num>
-  <w:num w:numId="2">
+  <w:num w:numId="2" w16cid:durableId="25571787">
     <w:abstractNumId w:val="8"/>
   </w:num>
-  <w:num w:numId="3">
+  <w:num w:numId="3" w16cid:durableId="408767224">
     <w:abstractNumId w:val="7"/>
   </w:num>
-  <w:num w:numId="4">
+  <w:num w:numId="4" w16cid:durableId="1180437190">
     <w:abstractNumId w:val="1"/>
   </w:num>
-  <w:num w:numId="5">
+  <w:num w:numId="5" w16cid:durableId="1976986861">
     <w:abstractNumId w:val="2"/>
   </w:num>
-  <w:num w:numId="6">
+  <w:num w:numId="6" w16cid:durableId="1411075568">
     <w:abstractNumId w:val="5"/>
   </w:num>
-  <w:num w:numId="7">
+  <w:num w:numId="7" w16cid:durableId="464741604">
     <w:abstractNumId w:val="3"/>
   </w:num>
-  <w:num w:numId="8">
+  <w:num w:numId="8" w16cid:durableId="1013722338">
     <w:abstractNumId w:val="6"/>
   </w:num>
-  <w:num w:numId="9">
+  <w:num w:numId="9" w16cid:durableId="1343555981">
     <w:abstractNumId w:val="4"/>
   </w:num>
 </w:numbering>
 </file>
 
 <file path=word/styles.xml><?xml version="1.0" encoding="utf-8"?>
-<w:styles xmlns:mc="http://schemas.openxmlformats.org/markup-compatibility/2006" xmlns:r="http://schemas.openxmlformats.org/officeDocument/2006/relationships" xmlns:w="http://schemas.openxmlformats.org/wordprocessingml/2006/main" xmlns:w14="http://schemas.microsoft.com/office/word/2010/wordml" xmlns:w15="http://schemas.microsoft.com/office/word/2012/wordml" xmlns:w16cex="http://schemas.microsoft.com/office/word/2018/wordml/cex" xmlns:w16cid="http://schemas.microsoft.com/office/word/2016/wordml/cid" xmlns:w16="http://schemas.microsoft.com/office/word/2018/wordml" xmlns:w16sdtdh="http://schemas.microsoft.com/office/word/2020/wordml/sdtdatahash" xmlns:w16se="http://schemas.microsoft.com/office/word/2015/wordml/symex" mc:Ignorable="w14 w15 w16se w16cid w16 w16cex w16sdtdh">
+<w:styles xmlns:mc="http://schemas.openxmlformats.org/markup-compatibility/2006" xmlns:r="http://schemas.openxmlformats.org/officeDocument/2006/relationships" xmlns:w="http://schemas.openxmlformats.org/wordprocessingml/2006/main" xmlns:w14="http://schemas.microsoft.com/office/word/2010/wordml" xmlns:w15="http://schemas.microsoft.com/office/word/2012/wordml" xmlns:w16cex="http://schemas.microsoft.com/office/word/2018/wordml/cex" xmlns:w16cid="http://schemas.microsoft.com/office/word/2016/wordml/cid" xmlns:w16="http://schemas.microsoft.com/office/word/2018/wordml" xmlns:w16du="http://schemas.microsoft.com/office/word/2023/wordml/word16du" xmlns:w16sdtdh="http://schemas.microsoft.com/office/word/2020/wordml/sdtdatahash" xmlns:w16sdtfl="http://schemas.microsoft.com/office/word/2024/wordml/sdtformatlock" xmlns:w16se="http://schemas.microsoft.com/office/word/2015/wordml/symex" mc:Ignorable="w14 w15 w16se w16cid w16 w16cex w16sdtdh w16sdtfl w16du">
   <w:docDefaults>
     <w:rPrDefault>
       <w:rPr>

</xml_diff>